<commit_message>
Add final review pronunciation assessment
</commit_message>
<xml_diff>
--- a/docs/태국어_25일_일별_주차별_학습계획.docx
+++ b/docs/태국어_25일_일별_주차별_학습계획.docx
@@ -5956,559 +5956,7 @@
                 <w:rFonts w:ascii="Malgun Gothic" w:hAnsi="Malgun Gothic" w:eastAsia="Malgun Gothic"/>
                 <w:sz w:val="18"/>
               </w:rPr>
-              <w:t>인사와 감사 전체 복습</w:t>
-            </w:r>
-          </w:p>
-        </w:tc>
-        <w:tc>
-          <w:tcPr>
-            <w:tcW w:type="dxa" w:w="1656"/>
-            <w:tcMar>
-              <w:top w:w="80" w:type="dxa"/>
-              <w:start w:w="120" w:type="dxa"/>
-              <w:bottom w:w="80" w:type="dxa"/>
-              <w:end w:w="120" w:type="dxa"/>
-            </w:tcMar>
-            <w:vAlign w:val="center"/>
-          </w:tcPr>
-          <w:p>
-            <w:pPr>
-              <w:spacing w:after="0" w:line="276" w:lineRule="auto"/>
-            </w:pPr>
-            <w:r>
-              <w:rPr>
-                <w:rFonts w:ascii="Malgun Gothic" w:hAnsi="Malgun Gothic" w:eastAsia="Malgun Gothic"/>
-                <w:sz w:val="18"/>
-              </w:rPr>
-              <w:t>-</w:t>
-            </w:r>
-          </w:p>
-        </w:tc>
-        <w:tc>
-          <w:tcPr>
-            <w:tcW w:type="dxa" w:w="1656"/>
-            <w:tcMar>
-              <w:top w:w="80" w:type="dxa"/>
-              <w:start w:w="120" w:type="dxa"/>
-              <w:bottom w:w="80" w:type="dxa"/>
-              <w:end w:w="120" w:type="dxa"/>
-            </w:tcMar>
-            <w:vAlign w:val="center"/>
-          </w:tcPr>
-          <w:p>
-            <w:pPr>
-              <w:spacing w:after="0" w:line="276" w:lineRule="auto"/>
-            </w:pPr>
-            <w:r>
-              <w:rPr>
-                <w:rFonts w:ascii="Malgun Gothic" w:hAnsi="Malgun Gothic" w:eastAsia="Malgun Gothic"/>
-                <w:sz w:val="18"/>
-              </w:rPr>
-              <w:t>새 단어 없음</w:t>
-              <w:br/>
-              <w:t>(누적 복습)</w:t>
-            </w:r>
-          </w:p>
-        </w:tc>
-        <w:tc>
-          <w:tcPr>
-            <w:tcW w:type="dxa" w:w="1800"/>
-            <w:tcMar>
-              <w:top w:w="80" w:type="dxa"/>
-              <w:start w:w="120" w:type="dxa"/>
-              <w:bottom w:w="80" w:type="dxa"/>
-              <w:end w:w="120" w:type="dxa"/>
-            </w:tcMar>
-            <w:vAlign w:val="center"/>
-          </w:tcPr>
-          <w:p>
-            <w:pPr>
-              <w:spacing w:after="0" w:line="276" w:lineRule="auto"/>
-            </w:pPr>
-            <w:r>
-              <w:rPr>
-                <w:rFonts w:ascii="Malgun Gothic" w:hAnsi="Malgun Gothic" w:eastAsia="Malgun Gothic"/>
-                <w:sz w:val="18"/>
-              </w:rPr>
-              <w:t>1. 안녕하세요</w:t>
-              <w:br/>
-              <w:t>2-1. 좋은 아침</w:t>
-              <w:br/>
-              <w:t>2-2. 좋은 저녁</w:t>
-              <w:br/>
-              <w:t>3. 정말 고마워요</w:t>
-              <w:br/>
-              <w:t>4. 천만에요</w:t>
-              <w:br/>
-              <w:t>5-1. 예</w:t>
-              <w:br/>
-              <w:t>5-2. 아니오</w:t>
-            </w:r>
-          </w:p>
-        </w:tc>
-        <w:tc>
-          <w:tcPr>
-            <w:tcW w:type="dxa" w:w="1584"/>
-            <w:tcMar>
-              <w:top w:w="80" w:type="dxa"/>
-              <w:start w:w="120" w:type="dxa"/>
-              <w:bottom w:w="80" w:type="dxa"/>
-              <w:end w:w="120" w:type="dxa"/>
-            </w:tcMar>
-            <w:vAlign w:val="center"/>
-          </w:tcPr>
-          <w:p>
-            <w:pPr>
-              <w:spacing w:after="0" w:line="276" w:lineRule="auto"/>
-            </w:pPr>
-            <w:r>
-              <w:rPr>
-                <w:rFonts w:ascii="Malgun Gothic" w:hAnsi="Malgun Gothic" w:eastAsia="Malgun Gothic"/>
-                <w:sz w:val="18"/>
-              </w:rPr>
-              <w:t>인사, 시간대 인사, 감사와 응답, 예/아니오를 순서대로 3회 연결해 말한다.</w:t>
-            </w:r>
-          </w:p>
-        </w:tc>
-      </w:tr>
-      <w:tr>
-        <w:tc>
-          <w:tcPr>
-            <w:tcW w:type="dxa" w:w="576"/>
-            <w:tcMar>
-              <w:top w:w="80" w:type="dxa"/>
-              <w:start w:w="120" w:type="dxa"/>
-              <w:bottom w:w="80" w:type="dxa"/>
-              <w:end w:w="120" w:type="dxa"/>
-            </w:tcMar>
-            <w:vAlign w:val="center"/>
-          </w:tcPr>
-          <w:p>
-            <w:pPr>
-              <w:spacing w:after="0" w:line="276" w:lineRule="auto"/>
-            </w:pPr>
-            <w:r>
-              <w:rPr>
-                <w:rFonts w:ascii="Malgun Gothic" w:hAnsi="Malgun Gothic" w:eastAsia="Malgun Gothic"/>
-                <w:sz w:val="18"/>
-              </w:rPr>
-              <w:t>22</w:t>
-            </w:r>
-          </w:p>
-        </w:tc>
-        <w:tc>
-          <w:tcPr>
-            <w:tcW w:type="dxa" w:w="792"/>
-            <w:tcMar>
-              <w:top w:w="80" w:type="dxa"/>
-              <w:start w:w="120" w:type="dxa"/>
-              <w:bottom w:w="80" w:type="dxa"/>
-              <w:end w:w="120" w:type="dxa"/>
-            </w:tcMar>
-            <w:vAlign w:val="center"/>
-          </w:tcPr>
-          <w:p>
-            <w:pPr>
-              <w:spacing w:after="0" w:line="276" w:lineRule="auto"/>
-            </w:pPr>
-            <w:r>
-              <w:rPr>
-                <w:rFonts w:ascii="Malgun Gothic" w:hAnsi="Malgun Gothic" w:eastAsia="Malgun Gothic"/>
-                <w:sz w:val="18"/>
-              </w:rPr>
-              <w:t>복습</w:t>
-            </w:r>
-          </w:p>
-        </w:tc>
-        <w:tc>
-          <w:tcPr>
-            <w:tcW w:type="dxa" w:w="1296"/>
-            <w:tcMar>
-              <w:top w:w="80" w:type="dxa"/>
-              <w:start w:w="120" w:type="dxa"/>
-              <w:bottom w:w="80" w:type="dxa"/>
-              <w:end w:w="120" w:type="dxa"/>
-            </w:tcMar>
-            <w:vAlign w:val="center"/>
-          </w:tcPr>
-          <w:p>
-            <w:pPr>
-              <w:spacing w:after="0" w:line="276" w:lineRule="auto"/>
-            </w:pPr>
-            <w:r>
-              <w:rPr>
-                <w:rFonts w:ascii="Malgun Gothic" w:hAnsi="Malgun Gothic" w:eastAsia="Malgun Gothic"/>
-                <w:sz w:val="18"/>
-              </w:rPr>
-              <w:t>새 친구와 자기소개 복습</w:t>
-            </w:r>
-          </w:p>
-        </w:tc>
-        <w:tc>
-          <w:tcPr>
-            <w:tcW w:type="dxa" w:w="1656"/>
-            <w:tcMar>
-              <w:top w:w="80" w:type="dxa"/>
-              <w:start w:w="120" w:type="dxa"/>
-              <w:bottom w:w="80" w:type="dxa"/>
-              <w:end w:w="120" w:type="dxa"/>
-            </w:tcMar>
-            <w:vAlign w:val="center"/>
-          </w:tcPr>
-          <w:p>
-            <w:pPr>
-              <w:spacing w:after="0" w:line="276" w:lineRule="auto"/>
-            </w:pPr>
-            <w:r>
-              <w:rPr>
-                <w:rFonts w:ascii="Malgun Gothic" w:hAnsi="Malgun Gothic" w:eastAsia="Malgun Gothic"/>
-                <w:sz w:val="18"/>
-              </w:rPr>
-              <w:t>-</w:t>
-            </w:r>
-          </w:p>
-        </w:tc>
-        <w:tc>
-          <w:tcPr>
-            <w:tcW w:type="dxa" w:w="1656"/>
-            <w:tcMar>
-              <w:top w:w="80" w:type="dxa"/>
-              <w:start w:w="120" w:type="dxa"/>
-              <w:bottom w:w="80" w:type="dxa"/>
-              <w:end w:w="120" w:type="dxa"/>
-            </w:tcMar>
-            <w:vAlign w:val="center"/>
-          </w:tcPr>
-          <w:p>
-            <w:pPr>
-              <w:spacing w:after="0" w:line="276" w:lineRule="auto"/>
-            </w:pPr>
-            <w:r>
-              <w:rPr>
-                <w:rFonts w:ascii="Malgun Gothic" w:hAnsi="Malgun Gothic" w:eastAsia="Malgun Gothic"/>
-                <w:sz w:val="18"/>
-              </w:rPr>
-              <w:t>새 단어 없음</w:t>
-              <w:br/>
-              <w:t>(누적 복습)</w:t>
-            </w:r>
-          </w:p>
-        </w:tc>
-        <w:tc>
-          <w:tcPr>
-            <w:tcW w:type="dxa" w:w="1800"/>
-            <w:tcMar>
-              <w:top w:w="80" w:type="dxa"/>
-              <w:start w:w="120" w:type="dxa"/>
-              <w:bottom w:w="80" w:type="dxa"/>
-              <w:end w:w="120" w:type="dxa"/>
-            </w:tcMar>
-            <w:vAlign w:val="center"/>
-          </w:tcPr>
-          <w:p>
-            <w:pPr>
-              <w:spacing w:after="0" w:line="276" w:lineRule="auto"/>
-            </w:pPr>
-            <w:r>
-              <w:rPr>
-                <w:rFonts w:ascii="Malgun Gothic" w:hAnsi="Malgun Gothic" w:eastAsia="Malgun Gothic"/>
-                <w:sz w:val="18"/>
-              </w:rPr>
-              <w:t>6. 실례/죄송합니다</w:t>
-              <w:br/>
-              <w:t>7. 괜찮아요</w:t>
-              <w:br/>
-              <w:t>8. 이름이 무엇인가요?</w:t>
-              <w:br/>
-              <w:t>9. 제 이름은 ~입니다</w:t>
-              <w:br/>
-              <w:t>10. 몇 살이니?</w:t>
-              <w:br/>
-              <w:t>10-2. 저는 ~살입니다</w:t>
-              <w:br/>
-              <w:t>22. 우리는 당신들을 사랑해요</w:t>
-            </w:r>
-          </w:p>
-        </w:tc>
-        <w:tc>
-          <w:tcPr>
-            <w:tcW w:type="dxa" w:w="1584"/>
-            <w:tcMar>
-              <w:top w:w="80" w:type="dxa"/>
-              <w:start w:w="120" w:type="dxa"/>
-              <w:bottom w:w="80" w:type="dxa"/>
-              <w:end w:w="120" w:type="dxa"/>
-            </w:tcMar>
-            <w:vAlign w:val="center"/>
-          </w:tcPr>
-          <w:p>
-            <w:pPr>
-              <w:spacing w:after="0" w:line="276" w:lineRule="auto"/>
-            </w:pPr>
-            <w:r>
-              <w:rPr>
-                <w:rFonts w:ascii="Malgun Gothic" w:hAnsi="Malgun Gothic" w:eastAsia="Malgun Gothic"/>
-                <w:sz w:val="18"/>
-              </w:rPr>
-              <w:t>실례합니다에서 자기소개, 우리는 당신들을 사랑해요까지 한 흐름으로 3회 역할극한다.</w:t>
-            </w:r>
-          </w:p>
-        </w:tc>
-      </w:tr>
-      <w:tr>
-        <w:tc>
-          <w:tcPr>
-            <w:tcW w:type="dxa" w:w="576"/>
-            <w:tcMar>
-              <w:top w:w="80" w:type="dxa"/>
-              <w:start w:w="120" w:type="dxa"/>
-              <w:bottom w:w="80" w:type="dxa"/>
-              <w:end w:w="120" w:type="dxa"/>
-            </w:tcMar>
-            <w:vAlign w:val="center"/>
-          </w:tcPr>
-          <w:p>
-            <w:pPr>
-              <w:spacing w:after="0" w:line="276" w:lineRule="auto"/>
-            </w:pPr>
-            <w:r>
-              <w:rPr>
-                <w:rFonts w:ascii="Malgun Gothic" w:hAnsi="Malgun Gothic" w:eastAsia="Malgun Gothic"/>
-                <w:sz w:val="18"/>
-              </w:rPr>
-              <w:t>23</w:t>
-            </w:r>
-          </w:p>
-        </w:tc>
-        <w:tc>
-          <w:tcPr>
-            <w:tcW w:type="dxa" w:w="792"/>
-            <w:tcMar>
-              <w:top w:w="80" w:type="dxa"/>
-              <w:start w:w="120" w:type="dxa"/>
-              <w:bottom w:w="80" w:type="dxa"/>
-              <w:end w:w="120" w:type="dxa"/>
-            </w:tcMar>
-            <w:vAlign w:val="center"/>
-          </w:tcPr>
-          <w:p>
-            <w:pPr>
-              <w:spacing w:after="0" w:line="276" w:lineRule="auto"/>
-            </w:pPr>
-            <w:r>
-              <w:rPr>
-                <w:rFonts w:ascii="Malgun Gothic" w:hAnsi="Malgun Gothic" w:eastAsia="Malgun Gothic"/>
-                <w:sz w:val="18"/>
-              </w:rPr>
-              <w:t>복습</w:t>
-            </w:r>
-          </w:p>
-        </w:tc>
-        <w:tc>
-          <w:tcPr>
-            <w:tcW w:type="dxa" w:w="1296"/>
-            <w:tcMar>
-              <w:top w:w="80" w:type="dxa"/>
-              <w:start w:w="120" w:type="dxa"/>
-              <w:bottom w:w="80" w:type="dxa"/>
-              <w:end w:w="120" w:type="dxa"/>
-            </w:tcMar>
-            <w:vAlign w:val="center"/>
-          </w:tcPr>
-          <w:p>
-            <w:pPr>
-              <w:spacing w:after="0" w:line="276" w:lineRule="auto"/>
-            </w:pPr>
-            <w:r>
-              <w:rPr>
-                <w:rFonts w:ascii="Malgun Gothic" w:hAnsi="Malgun Gothic" w:eastAsia="Malgun Gothic"/>
-                <w:sz w:val="18"/>
-              </w:rPr>
-              <w:t>생활 대화와 돌봄 복습</w:t>
-            </w:r>
-          </w:p>
-        </w:tc>
-        <w:tc>
-          <w:tcPr>
-            <w:tcW w:type="dxa" w:w="1656"/>
-            <w:tcMar>
-              <w:top w:w="80" w:type="dxa"/>
-              <w:start w:w="120" w:type="dxa"/>
-              <w:bottom w:w="80" w:type="dxa"/>
-              <w:end w:w="120" w:type="dxa"/>
-            </w:tcMar>
-            <w:vAlign w:val="center"/>
-          </w:tcPr>
-          <w:p>
-            <w:pPr>
-              <w:spacing w:after="0" w:line="276" w:lineRule="auto"/>
-            </w:pPr>
-            <w:r>
-              <w:rPr>
-                <w:rFonts w:ascii="Malgun Gothic" w:hAnsi="Malgun Gothic" w:eastAsia="Malgun Gothic"/>
-                <w:sz w:val="18"/>
-              </w:rPr>
-              <w:t>-</w:t>
-            </w:r>
-          </w:p>
-        </w:tc>
-        <w:tc>
-          <w:tcPr>
-            <w:tcW w:type="dxa" w:w="1656"/>
-            <w:tcMar>
-              <w:top w:w="80" w:type="dxa"/>
-              <w:start w:w="120" w:type="dxa"/>
-              <w:bottom w:w="80" w:type="dxa"/>
-              <w:end w:w="120" w:type="dxa"/>
-            </w:tcMar>
-            <w:vAlign w:val="center"/>
-          </w:tcPr>
-          <w:p>
-            <w:pPr>
-              <w:spacing w:after="0" w:line="276" w:lineRule="auto"/>
-            </w:pPr>
-            <w:r>
-              <w:rPr>
-                <w:rFonts w:ascii="Malgun Gothic" w:hAnsi="Malgun Gothic" w:eastAsia="Malgun Gothic"/>
-                <w:sz w:val="18"/>
-              </w:rPr>
-              <w:t>새 단어 없음</w:t>
-              <w:br/>
-              <w:t>(누적 복습)</w:t>
-            </w:r>
-          </w:p>
-        </w:tc>
-        <w:tc>
-          <w:tcPr>
-            <w:tcW w:type="dxa" w:w="1800"/>
-            <w:tcMar>
-              <w:top w:w="80" w:type="dxa"/>
-              <w:start w:w="120" w:type="dxa"/>
-              <w:bottom w:w="80" w:type="dxa"/>
-              <w:end w:w="120" w:type="dxa"/>
-            </w:tcMar>
-            <w:vAlign w:val="center"/>
-          </w:tcPr>
-          <w:p>
-            <w:pPr>
-              <w:spacing w:after="0" w:line="276" w:lineRule="auto"/>
-            </w:pPr>
-            <w:r>
-              <w:rPr>
-                <w:rFonts w:ascii="Malgun Gothic" w:hAnsi="Malgun Gothic" w:eastAsia="Malgun Gothic"/>
-                <w:sz w:val="18"/>
-              </w:rPr>
-              <w:t>11. 화장실 어디 있어요?</w:t>
-              <w:br/>
-              <w:t>12. 맛있게 드세요</w:t>
-              <w:br/>
-              <w:t>13. 정말 맛있어요</w:t>
-              <w:br/>
-              <w:t>14. 참 잘했어요</w:t>
-              <w:br/>
-              <w:t>15. 잘 가요</w:t>
-              <w:br/>
-              <w:t>16. 다시 만나요</w:t>
-              <w:br/>
-              <w:t>23. 기도해 드릴게요</w:t>
-            </w:r>
-          </w:p>
-        </w:tc>
-        <w:tc>
-          <w:tcPr>
-            <w:tcW w:type="dxa" w:w="1584"/>
-            <w:tcMar>
-              <w:top w:w="80" w:type="dxa"/>
-              <w:start w:w="120" w:type="dxa"/>
-              <w:bottom w:w="80" w:type="dxa"/>
-              <w:end w:w="120" w:type="dxa"/>
-            </w:tcMar>
-            <w:vAlign w:val="center"/>
-          </w:tcPr>
-          <w:p>
-            <w:pPr>
-              <w:spacing w:after="0" w:line="276" w:lineRule="auto"/>
-            </w:pPr>
-            <w:r>
-              <w:rPr>
-                <w:rFonts w:ascii="Malgun Gothic" w:hAnsi="Malgun Gothic" w:eastAsia="Malgun Gothic"/>
-                <w:sz w:val="18"/>
-              </w:rPr>
-              <w:t>화장실 질문, 식사 표현, 칭찬, 작별, 기도해 드릴게요를 순서대로 3회 말한다.</w:t>
-            </w:r>
-          </w:p>
-        </w:tc>
-      </w:tr>
-      <w:tr>
-        <w:tc>
-          <w:tcPr>
-            <w:tcW w:type="dxa" w:w="576"/>
-            <w:tcMar>
-              <w:top w:w="80" w:type="dxa"/>
-              <w:start w:w="120" w:type="dxa"/>
-              <w:bottom w:w="80" w:type="dxa"/>
-              <w:end w:w="120" w:type="dxa"/>
-            </w:tcMar>
-            <w:vAlign w:val="center"/>
-          </w:tcPr>
-          <w:p>
-            <w:pPr>
-              <w:spacing w:after="0" w:line="276" w:lineRule="auto"/>
-            </w:pPr>
-            <w:r>
-              <w:rPr>
-                <w:rFonts w:ascii="Malgun Gothic" w:hAnsi="Malgun Gothic" w:eastAsia="Malgun Gothic"/>
-                <w:sz w:val="18"/>
-              </w:rPr>
-              <w:t>24</w:t>
-            </w:r>
-          </w:p>
-        </w:tc>
-        <w:tc>
-          <w:tcPr>
-            <w:tcW w:type="dxa" w:w="792"/>
-            <w:tcMar>
-              <w:top w:w="80" w:type="dxa"/>
-              <w:start w:w="120" w:type="dxa"/>
-              <w:bottom w:w="80" w:type="dxa"/>
-              <w:end w:w="120" w:type="dxa"/>
-            </w:tcMar>
-            <w:vAlign w:val="center"/>
-          </w:tcPr>
-          <w:p>
-            <w:pPr>
-              <w:spacing w:after="0" w:line="276" w:lineRule="auto"/>
-            </w:pPr>
-            <w:r>
-              <w:rPr>
-                <w:rFonts w:ascii="Malgun Gothic" w:hAnsi="Malgun Gothic" w:eastAsia="Malgun Gothic"/>
-                <w:sz w:val="18"/>
-              </w:rPr>
-              <w:t>복습</w:t>
-            </w:r>
-          </w:p>
-        </w:tc>
-        <w:tc>
-          <w:tcPr>
-            <w:tcW w:type="dxa" w:w="1296"/>
-            <w:tcMar>
-              <w:top w:w="80" w:type="dxa"/>
-              <w:start w:w="120" w:type="dxa"/>
-              <w:bottom w:w="80" w:type="dxa"/>
-              <w:end w:w="120" w:type="dxa"/>
-            </w:tcMar>
-            <w:vAlign w:val="center"/>
-          </w:tcPr>
-          <w:p>
-            <w:pPr>
-              <w:spacing w:after="0" w:line="276" w:lineRule="auto"/>
-            </w:pPr>
-            <w:r>
-              <w:rPr>
-                <w:rFonts w:ascii="Malgun Gothic" w:hAnsi="Malgun Gothic" w:eastAsia="Malgun Gothic"/>
-                <w:sz w:val="18"/>
-              </w:rPr>
-              <w:t>사랑·축복·믿음·찬양 복습</w:t>
+              <w:t>선교언어 전체 문장 복습</w:t>
             </w:r>
           </w:p>
         </w:tc>
@@ -6592,6 +6040,10 @@
               <w:br/>
               <w:t>21. 예수님 믿으세요</w:t>
               <w:br/>
+              <w:t>22. 우리는 당신들을 사랑해요</w:t>
+              <w:br/>
+              <w:t>23. 기도해 드릴게요</w:t>
+              <w:br/>
               <w:t>24. 함께 찬양해요</w:t>
             </w:r>
           </w:p>
@@ -6616,7 +6068,7 @@
                 <w:rFonts w:ascii="Malgun Gothic" w:hAnsi="Malgun Gothic" w:eastAsia="Malgun Gothic"/>
                 <w:sz w:val="18"/>
               </w:rPr>
-              <w:t>사랑, 축복, 믿음의 초대, 찬양 초대를 한 흐름으로 3회 역할극한다.</w:t>
+              <w:t>8개 선교언어 문장을 하나씩 듣고 따라 말한 뒤, 점수와 인식 결과를 확인한다.</w:t>
             </w:r>
           </w:p>
         </w:tc>
@@ -6642,7 +6094,7 @@
                 <w:rFonts w:ascii="Malgun Gothic" w:hAnsi="Malgun Gothic" w:eastAsia="Malgun Gothic"/>
                 <w:sz w:val="18"/>
               </w:rPr>
-              <w:t>25</w:t>
+              <w:t>22</w:t>
             </w:r>
           </w:p>
         </w:tc>
@@ -6690,7 +6142,7 @@
                 <w:rFonts w:ascii="Malgun Gothic" w:hAnsi="Malgun Gothic" w:eastAsia="Malgun Gothic"/>
                 <w:sz w:val="18"/>
               </w:rPr>
-              <w:t>전체 문장 종합 리허설</w:t>
+              <w:t>생활회화 전체 문장 복습</w:t>
             </w:r>
           </w:p>
         </w:tc>
@@ -6801,7 +6253,177 @@
               <w:t>15. 잘 가요</w:t>
               <w:br/>
               <w:t>16. 다시 만나요</w:t>
+            </w:r>
+          </w:p>
+        </w:tc>
+        <w:tc>
+          <w:tcPr>
+            <w:tcW w:type="dxa" w:w="1584"/>
+            <w:tcMar>
+              <w:top w:w="80" w:type="dxa"/>
+              <w:start w:w="120" w:type="dxa"/>
+              <w:bottom w:w="80" w:type="dxa"/>
+              <w:end w:w="120" w:type="dxa"/>
+            </w:tcMar>
+            <w:vAlign w:val="center"/>
+          </w:tcPr>
+          <w:p>
+            <w:pPr>
+              <w:spacing w:after="0" w:line="276" w:lineRule="auto"/>
+            </w:pPr>
+            <w:r>
+              <w:rPr>
+                <w:rFonts w:ascii="Malgun Gothic" w:hAnsi="Malgun Gothic" w:eastAsia="Malgun Gothic"/>
+                <w:sz w:val="18"/>
+              </w:rPr>
+              <w:t>생활회화 문장을 하나씩 듣고 따라 말한 뒤, 점수와 인식 결과를 확인한다.</w:t>
+            </w:r>
+          </w:p>
+        </w:tc>
+      </w:tr>
+      <w:tr>
+        <w:tc>
+          <w:tcPr>
+            <w:tcW w:type="dxa" w:w="576"/>
+            <w:tcMar>
+              <w:top w:w="80" w:type="dxa"/>
+              <w:start w:w="120" w:type="dxa"/>
+              <w:bottom w:w="80" w:type="dxa"/>
+              <w:end w:w="120" w:type="dxa"/>
+            </w:tcMar>
+            <w:vAlign w:val="center"/>
+          </w:tcPr>
+          <w:p>
+            <w:pPr>
+              <w:spacing w:after="0" w:line="276" w:lineRule="auto"/>
+            </w:pPr>
+            <w:r>
+              <w:rPr>
+                <w:rFonts w:ascii="Malgun Gothic" w:hAnsi="Malgun Gothic" w:eastAsia="Malgun Gothic"/>
+                <w:sz w:val="18"/>
+              </w:rPr>
+              <w:t>23</w:t>
+            </w:r>
+          </w:p>
+        </w:tc>
+        <w:tc>
+          <w:tcPr>
+            <w:tcW w:type="dxa" w:w="792"/>
+            <w:tcMar>
+              <w:top w:w="80" w:type="dxa"/>
+              <w:start w:w="120" w:type="dxa"/>
+              <w:bottom w:w="80" w:type="dxa"/>
+              <w:end w:w="120" w:type="dxa"/>
+            </w:tcMar>
+            <w:vAlign w:val="center"/>
+          </w:tcPr>
+          <w:p>
+            <w:pPr>
+              <w:spacing w:after="0" w:line="276" w:lineRule="auto"/>
+            </w:pPr>
+            <w:r>
+              <w:rPr>
+                <w:rFonts w:ascii="Malgun Gothic" w:hAnsi="Malgun Gothic" w:eastAsia="Malgun Gothic"/>
+                <w:sz w:val="18"/>
+              </w:rPr>
+              <w:t>복습</w:t>
+            </w:r>
+          </w:p>
+        </w:tc>
+        <w:tc>
+          <w:tcPr>
+            <w:tcW w:type="dxa" w:w="1296"/>
+            <w:tcMar>
+              <w:top w:w="80" w:type="dxa"/>
+              <w:start w:w="120" w:type="dxa"/>
+              <w:bottom w:w="80" w:type="dxa"/>
+              <w:end w:w="120" w:type="dxa"/>
+            </w:tcMar>
+            <w:vAlign w:val="center"/>
+          </w:tcPr>
+          <w:p>
+            <w:pPr>
+              <w:spacing w:after="0" w:line="276" w:lineRule="auto"/>
+            </w:pPr>
+            <w:r>
+              <w:rPr>
+                <w:rFonts w:ascii="Malgun Gothic" w:hAnsi="Malgun Gothic" w:eastAsia="Malgun Gothic"/>
+                <w:sz w:val="18"/>
+              </w:rPr>
+              <w:t>선교언어 전체 문장 반복 복습</w:t>
+            </w:r>
+          </w:p>
+        </w:tc>
+        <w:tc>
+          <w:tcPr>
+            <w:tcW w:type="dxa" w:w="1656"/>
+            <w:tcMar>
+              <w:top w:w="80" w:type="dxa"/>
+              <w:start w:w="120" w:type="dxa"/>
+              <w:bottom w:w="80" w:type="dxa"/>
+              <w:end w:w="120" w:type="dxa"/>
+            </w:tcMar>
+            <w:vAlign w:val="center"/>
+          </w:tcPr>
+          <w:p>
+            <w:pPr>
+              <w:spacing w:after="0" w:line="276" w:lineRule="auto"/>
+            </w:pPr>
+            <w:r>
+              <w:rPr>
+                <w:rFonts w:ascii="Malgun Gothic" w:hAnsi="Malgun Gothic" w:eastAsia="Malgun Gothic"/>
+                <w:sz w:val="18"/>
+              </w:rPr>
+              <w:t>-</w:t>
+            </w:r>
+          </w:p>
+        </w:tc>
+        <w:tc>
+          <w:tcPr>
+            <w:tcW w:type="dxa" w:w="1656"/>
+            <w:tcMar>
+              <w:top w:w="80" w:type="dxa"/>
+              <w:start w:w="120" w:type="dxa"/>
+              <w:bottom w:w="80" w:type="dxa"/>
+              <w:end w:w="120" w:type="dxa"/>
+            </w:tcMar>
+            <w:vAlign w:val="center"/>
+          </w:tcPr>
+          <w:p>
+            <w:pPr>
+              <w:spacing w:after="0" w:line="276" w:lineRule="auto"/>
+            </w:pPr>
+            <w:r>
+              <w:rPr>
+                <w:rFonts w:ascii="Malgun Gothic" w:hAnsi="Malgun Gothic" w:eastAsia="Malgun Gothic"/>
+                <w:sz w:val="18"/>
+              </w:rPr>
+              <w:t>새 단어 없음</w:t>
               <w:br/>
+              <w:t>(누적 복습)</w:t>
+            </w:r>
+          </w:p>
+        </w:tc>
+        <w:tc>
+          <w:tcPr>
+            <w:tcW w:type="dxa" w:w="1800"/>
+            <w:tcMar>
+              <w:top w:w="80" w:type="dxa"/>
+              <w:start w:w="120" w:type="dxa"/>
+              <w:bottom w:w="80" w:type="dxa"/>
+              <w:end w:w="120" w:type="dxa"/>
+            </w:tcMar>
+            <w:vAlign w:val="center"/>
+          </w:tcPr>
+          <w:p>
+            <w:pPr>
+              <w:spacing w:after="0" w:line="276" w:lineRule="auto"/>
+            </w:pPr>
+            <w:r>
+              <w:rPr>
+                <w:rFonts w:ascii="Malgun Gothic" w:hAnsi="Malgun Gothic" w:eastAsia="Malgun Gothic"/>
+                <w:sz w:val="18"/>
+              </w:rPr>
               <w:t>17. 예수님이 당신을 사랑해요</w:t>
               <w:br/>
               <w:t>18. 하나님은 당신을 사랑해요</w:t>
@@ -6840,7 +6462,401 @@
                 <w:rFonts w:ascii="Malgun Gothic" w:hAnsi="Malgun Gothic" w:eastAsia="Malgun Gothic"/>
                 <w:sz w:val="18"/>
               </w:rPr>
-              <w:t>전체 문장을 장면별로 끊어 1회, 처음부터 끝까지 연결해 2회 리허설한다.</w:t>
+              <w:t>21일차 선교언어 8문장을 다시 듣고 따라 말하며 점수와 인식 결과를 확인한다.</w:t>
+            </w:r>
+          </w:p>
+        </w:tc>
+      </w:tr>
+      <w:tr>
+        <w:tc>
+          <w:tcPr>
+            <w:tcW w:type="dxa" w:w="576"/>
+            <w:tcMar>
+              <w:top w:w="80" w:type="dxa"/>
+              <w:start w:w="120" w:type="dxa"/>
+              <w:bottom w:w="80" w:type="dxa"/>
+              <w:end w:w="120" w:type="dxa"/>
+            </w:tcMar>
+            <w:vAlign w:val="center"/>
+          </w:tcPr>
+          <w:p>
+            <w:pPr>
+              <w:spacing w:after="0" w:line="276" w:lineRule="auto"/>
+            </w:pPr>
+            <w:r>
+              <w:rPr>
+                <w:rFonts w:ascii="Malgun Gothic" w:hAnsi="Malgun Gothic" w:eastAsia="Malgun Gothic"/>
+                <w:sz w:val="18"/>
+              </w:rPr>
+              <w:t>24</w:t>
+            </w:r>
+          </w:p>
+        </w:tc>
+        <w:tc>
+          <w:tcPr>
+            <w:tcW w:type="dxa" w:w="792"/>
+            <w:tcMar>
+              <w:top w:w="80" w:type="dxa"/>
+              <w:start w:w="120" w:type="dxa"/>
+              <w:bottom w:w="80" w:type="dxa"/>
+              <w:end w:w="120" w:type="dxa"/>
+            </w:tcMar>
+            <w:vAlign w:val="center"/>
+          </w:tcPr>
+          <w:p>
+            <w:pPr>
+              <w:spacing w:after="0" w:line="276" w:lineRule="auto"/>
+            </w:pPr>
+            <w:r>
+              <w:rPr>
+                <w:rFonts w:ascii="Malgun Gothic" w:hAnsi="Malgun Gothic" w:eastAsia="Malgun Gothic"/>
+                <w:sz w:val="18"/>
+              </w:rPr>
+              <w:t>복습</w:t>
+            </w:r>
+          </w:p>
+        </w:tc>
+        <w:tc>
+          <w:tcPr>
+            <w:tcW w:type="dxa" w:w="1296"/>
+            <w:tcMar>
+              <w:top w:w="80" w:type="dxa"/>
+              <w:start w:w="120" w:type="dxa"/>
+              <w:bottom w:w="80" w:type="dxa"/>
+              <w:end w:w="120" w:type="dxa"/>
+            </w:tcMar>
+            <w:vAlign w:val="center"/>
+          </w:tcPr>
+          <w:p>
+            <w:pPr>
+              <w:spacing w:after="0" w:line="276" w:lineRule="auto"/>
+            </w:pPr>
+            <w:r>
+              <w:rPr>
+                <w:rFonts w:ascii="Malgun Gothic" w:hAnsi="Malgun Gothic" w:eastAsia="Malgun Gothic"/>
+                <w:sz w:val="18"/>
+              </w:rPr>
+              <w:t>생활회화 전체 문장 반복 복습</w:t>
+            </w:r>
+          </w:p>
+        </w:tc>
+        <w:tc>
+          <w:tcPr>
+            <w:tcW w:type="dxa" w:w="1656"/>
+            <w:tcMar>
+              <w:top w:w="80" w:type="dxa"/>
+              <w:start w:w="120" w:type="dxa"/>
+              <w:bottom w:w="80" w:type="dxa"/>
+              <w:end w:w="120" w:type="dxa"/>
+            </w:tcMar>
+            <w:vAlign w:val="center"/>
+          </w:tcPr>
+          <w:p>
+            <w:pPr>
+              <w:spacing w:after="0" w:line="276" w:lineRule="auto"/>
+            </w:pPr>
+            <w:r>
+              <w:rPr>
+                <w:rFonts w:ascii="Malgun Gothic" w:hAnsi="Malgun Gothic" w:eastAsia="Malgun Gothic"/>
+                <w:sz w:val="18"/>
+              </w:rPr>
+              <w:t>-</w:t>
+            </w:r>
+          </w:p>
+        </w:tc>
+        <w:tc>
+          <w:tcPr>
+            <w:tcW w:type="dxa" w:w="1656"/>
+            <w:tcMar>
+              <w:top w:w="80" w:type="dxa"/>
+              <w:start w:w="120" w:type="dxa"/>
+              <w:bottom w:w="80" w:type="dxa"/>
+              <w:end w:w="120" w:type="dxa"/>
+            </w:tcMar>
+            <w:vAlign w:val="center"/>
+          </w:tcPr>
+          <w:p>
+            <w:pPr>
+              <w:spacing w:after="0" w:line="276" w:lineRule="auto"/>
+            </w:pPr>
+            <w:r>
+              <w:rPr>
+                <w:rFonts w:ascii="Malgun Gothic" w:hAnsi="Malgun Gothic" w:eastAsia="Malgun Gothic"/>
+                <w:sz w:val="18"/>
+              </w:rPr>
+              <w:t>새 단어 없음</w:t>
+              <w:br/>
+              <w:t>(누적 복습)</w:t>
+            </w:r>
+          </w:p>
+        </w:tc>
+        <w:tc>
+          <w:tcPr>
+            <w:tcW w:type="dxa" w:w="1800"/>
+            <w:tcMar>
+              <w:top w:w="80" w:type="dxa"/>
+              <w:start w:w="120" w:type="dxa"/>
+              <w:bottom w:w="80" w:type="dxa"/>
+              <w:end w:w="120" w:type="dxa"/>
+            </w:tcMar>
+            <w:vAlign w:val="center"/>
+          </w:tcPr>
+          <w:p>
+            <w:pPr>
+              <w:spacing w:after="0" w:line="276" w:lineRule="auto"/>
+            </w:pPr>
+            <w:r>
+              <w:rPr>
+                <w:rFonts w:ascii="Malgun Gothic" w:hAnsi="Malgun Gothic" w:eastAsia="Malgun Gothic"/>
+                <w:sz w:val="18"/>
+              </w:rPr>
+              <w:t>1. 안녕하세요</w:t>
+              <w:br/>
+              <w:t>2-1. 좋은 아침</w:t>
+              <w:br/>
+              <w:t>2-2. 좋은 저녁</w:t>
+              <w:br/>
+              <w:t>3. 정말 고마워요</w:t>
+              <w:br/>
+              <w:t>4. 천만에요</w:t>
+              <w:br/>
+              <w:t>5-1. 예</w:t>
+              <w:br/>
+              <w:t>5-2. 아니오</w:t>
+              <w:br/>
+              <w:t>6. 실례/죄송합니다</w:t>
+              <w:br/>
+              <w:t>7. 괜찮아요</w:t>
+              <w:br/>
+              <w:t>8. 이름이 무엇인가요?</w:t>
+              <w:br/>
+              <w:t>9. 제 이름은 ~입니다</w:t>
+              <w:br/>
+              <w:t>10. 몇 살이니?</w:t>
+              <w:br/>
+              <w:t>10-2. 저는 ~살입니다</w:t>
+              <w:br/>
+              <w:t>11. 화장실 어디 있어요?</w:t>
+              <w:br/>
+              <w:t>12. 맛있게 드세요</w:t>
+              <w:br/>
+              <w:t>13. 정말 맛있어요</w:t>
+              <w:br/>
+              <w:t>14. 참 잘했어요</w:t>
+              <w:br/>
+              <w:t>15. 잘 가요</w:t>
+              <w:br/>
+              <w:t>16. 다시 만나요</w:t>
+            </w:r>
+          </w:p>
+        </w:tc>
+        <w:tc>
+          <w:tcPr>
+            <w:tcW w:type="dxa" w:w="1584"/>
+            <w:tcMar>
+              <w:top w:w="80" w:type="dxa"/>
+              <w:start w:w="120" w:type="dxa"/>
+              <w:bottom w:w="80" w:type="dxa"/>
+              <w:end w:w="120" w:type="dxa"/>
+            </w:tcMar>
+            <w:vAlign w:val="center"/>
+          </w:tcPr>
+          <w:p>
+            <w:pPr>
+              <w:spacing w:after="0" w:line="276" w:lineRule="auto"/>
+            </w:pPr>
+            <w:r>
+              <w:rPr>
+                <w:rFonts w:ascii="Malgun Gothic" w:hAnsi="Malgun Gothic" w:eastAsia="Malgun Gothic"/>
+                <w:sz w:val="18"/>
+              </w:rPr>
+              <w:t>22일차 생활회화 문장을 다시 듣고 따라 말하며 점수와 인식 결과를 확인한다.</w:t>
+            </w:r>
+          </w:p>
+        </w:tc>
+      </w:tr>
+      <w:tr>
+        <w:tc>
+          <w:tcPr>
+            <w:tcW w:type="dxa" w:w="576"/>
+            <w:tcMar>
+              <w:top w:w="80" w:type="dxa"/>
+              <w:start w:w="120" w:type="dxa"/>
+              <w:bottom w:w="80" w:type="dxa"/>
+              <w:end w:w="120" w:type="dxa"/>
+            </w:tcMar>
+            <w:vAlign w:val="center"/>
+          </w:tcPr>
+          <w:p>
+            <w:pPr>
+              <w:spacing w:after="0" w:line="276" w:lineRule="auto"/>
+            </w:pPr>
+            <w:r>
+              <w:rPr>
+                <w:rFonts w:ascii="Malgun Gothic" w:hAnsi="Malgun Gothic" w:eastAsia="Malgun Gothic"/>
+                <w:sz w:val="18"/>
+              </w:rPr>
+              <w:t>25</w:t>
+            </w:r>
+          </w:p>
+        </w:tc>
+        <w:tc>
+          <w:tcPr>
+            <w:tcW w:type="dxa" w:w="792"/>
+            <w:tcMar>
+              <w:top w:w="80" w:type="dxa"/>
+              <w:start w:w="120" w:type="dxa"/>
+              <w:bottom w:w="80" w:type="dxa"/>
+              <w:end w:w="120" w:type="dxa"/>
+            </w:tcMar>
+            <w:vAlign w:val="center"/>
+          </w:tcPr>
+          <w:p>
+            <w:pPr>
+              <w:spacing w:after="0" w:line="276" w:lineRule="auto"/>
+            </w:pPr>
+            <w:r>
+              <w:rPr>
+                <w:rFonts w:ascii="Malgun Gothic" w:hAnsi="Malgun Gothic" w:eastAsia="Malgun Gothic"/>
+                <w:sz w:val="18"/>
+              </w:rPr>
+              <w:t>복습</w:t>
+            </w:r>
+          </w:p>
+        </w:tc>
+        <w:tc>
+          <w:tcPr>
+            <w:tcW w:type="dxa" w:w="1296"/>
+            <w:tcMar>
+              <w:top w:w="80" w:type="dxa"/>
+              <w:start w:w="120" w:type="dxa"/>
+              <w:bottom w:w="80" w:type="dxa"/>
+              <w:end w:w="120" w:type="dxa"/>
+            </w:tcMar>
+            <w:vAlign w:val="center"/>
+          </w:tcPr>
+          <w:p>
+            <w:pPr>
+              <w:spacing w:after="0" w:line="276" w:lineRule="auto"/>
+            </w:pPr>
+            <w:r>
+              <w:rPr>
+                <w:rFonts w:ascii="Malgun Gothic" w:hAnsi="Malgun Gothic" w:eastAsia="Malgun Gothic"/>
+                <w:sz w:val="18"/>
+              </w:rPr>
+              <w:t>선교언어 최종 반복 복습</w:t>
+            </w:r>
+          </w:p>
+        </w:tc>
+        <w:tc>
+          <w:tcPr>
+            <w:tcW w:type="dxa" w:w="1656"/>
+            <w:tcMar>
+              <w:top w:w="80" w:type="dxa"/>
+              <w:start w:w="120" w:type="dxa"/>
+              <w:bottom w:w="80" w:type="dxa"/>
+              <w:end w:w="120" w:type="dxa"/>
+            </w:tcMar>
+            <w:vAlign w:val="center"/>
+          </w:tcPr>
+          <w:p>
+            <w:pPr>
+              <w:spacing w:after="0" w:line="276" w:lineRule="auto"/>
+            </w:pPr>
+            <w:r>
+              <w:rPr>
+                <w:rFonts w:ascii="Malgun Gothic" w:hAnsi="Malgun Gothic" w:eastAsia="Malgun Gothic"/>
+                <w:sz w:val="18"/>
+              </w:rPr>
+              <w:t>-</w:t>
+            </w:r>
+          </w:p>
+        </w:tc>
+        <w:tc>
+          <w:tcPr>
+            <w:tcW w:type="dxa" w:w="1656"/>
+            <w:tcMar>
+              <w:top w:w="80" w:type="dxa"/>
+              <w:start w:w="120" w:type="dxa"/>
+              <w:bottom w:w="80" w:type="dxa"/>
+              <w:end w:w="120" w:type="dxa"/>
+            </w:tcMar>
+            <w:vAlign w:val="center"/>
+          </w:tcPr>
+          <w:p>
+            <w:pPr>
+              <w:spacing w:after="0" w:line="276" w:lineRule="auto"/>
+            </w:pPr>
+            <w:r>
+              <w:rPr>
+                <w:rFonts w:ascii="Malgun Gothic" w:hAnsi="Malgun Gothic" w:eastAsia="Malgun Gothic"/>
+                <w:sz w:val="18"/>
+              </w:rPr>
+              <w:t>새 단어 없음</w:t>
+              <w:br/>
+              <w:t>(누적 복습)</w:t>
+            </w:r>
+          </w:p>
+        </w:tc>
+        <w:tc>
+          <w:tcPr>
+            <w:tcW w:type="dxa" w:w="1800"/>
+            <w:tcMar>
+              <w:top w:w="80" w:type="dxa"/>
+              <w:start w:w="120" w:type="dxa"/>
+              <w:bottom w:w="80" w:type="dxa"/>
+              <w:end w:w="120" w:type="dxa"/>
+            </w:tcMar>
+            <w:vAlign w:val="center"/>
+          </w:tcPr>
+          <w:p>
+            <w:pPr>
+              <w:spacing w:after="0" w:line="276" w:lineRule="auto"/>
+            </w:pPr>
+            <w:r>
+              <w:rPr>
+                <w:rFonts w:ascii="Malgun Gothic" w:hAnsi="Malgun Gothic" w:eastAsia="Malgun Gothic"/>
+                <w:sz w:val="18"/>
+              </w:rPr>
+              <w:t>17. 예수님이 당신을 사랑해요</w:t>
+              <w:br/>
+              <w:t>18. 하나님은 당신을 사랑해요</w:t>
+              <w:br/>
+              <w:t>19. 하나님의 축복을!</w:t>
+              <w:br/>
+              <w:t>20. 하나님은 사랑이십니다</w:t>
+              <w:br/>
+              <w:t>21. 예수님 믿으세요</w:t>
+              <w:br/>
+              <w:t>22. 우리는 당신들을 사랑해요</w:t>
+              <w:br/>
+              <w:t>23. 기도해 드릴게요</w:t>
+              <w:br/>
+              <w:t>24. 함께 찬양해요</w:t>
+            </w:r>
+          </w:p>
+        </w:tc>
+        <w:tc>
+          <w:tcPr>
+            <w:tcW w:type="dxa" w:w="1584"/>
+            <w:tcMar>
+              <w:top w:w="80" w:type="dxa"/>
+              <w:start w:w="120" w:type="dxa"/>
+              <w:bottom w:w="80" w:type="dxa"/>
+              <w:end w:w="120" w:type="dxa"/>
+            </w:tcMar>
+            <w:vAlign w:val="center"/>
+          </w:tcPr>
+          <w:p>
+            <w:pPr>
+              <w:spacing w:after="0" w:line="276" w:lineRule="auto"/>
+            </w:pPr>
+            <w:r>
+              <w:rPr>
+                <w:rFonts w:ascii="Malgun Gothic" w:hAnsi="Malgun Gothic" w:eastAsia="Malgun Gothic"/>
+                <w:sz w:val="18"/>
+              </w:rPr>
+              <w:t>선교언어 8문장을 최종으로 듣고 따라 말하며 점수와 인식 결과를 확인한다.</w:t>
             </w:r>
           </w:p>
         </w:tc>
@@ -7645,7 +7661,7 @@
                 <w:rFonts w:ascii="Malgun Gothic" w:hAnsi="Malgun Gothic" w:eastAsia="Malgun Gothic"/>
                 <w:sz w:val="18"/>
               </w:rPr>
-              <w:t>전체 문장 종합 역할극</w:t>
+              <w:t>생활회화 전체 문장 토요 복습</w:t>
             </w:r>
           </w:p>
         </w:tc>
@@ -7669,7 +7685,7 @@
                 <w:rFonts w:ascii="Malgun Gothic" w:hAnsi="Malgun Gothic" w:eastAsia="Malgun Gothic"/>
                 <w:sz w:val="18"/>
               </w:rPr>
-              <w:t>한국 선교팀, 태국 교회 성도, 처음 온 방문객이 만난다. 인사와 자기소개, 식사와 도움, 사랑과 축복, 믿음의 초대, 기도와 찬양 초대, 작별까지 전체 흐름으로 연습한다.</w:t>
+              <w:t>인사, 감사, 예/아니오, 실례합니다와 괜찮아요, 이름과 나이 묻고 답하기, 식사와 칭찬, 작별까지 생활회화 전체를 토요일에 다시 반복한다.</w:t>
             </w:r>
           </w:p>
         </w:tc>
@@ -7694,16 +7710,30 @@
                 <w:sz w:val="18"/>
               </w:rPr>
               <w:t>1. 안녕하세요</w:t>
+              <w:br/>
+              <w:t>2-1. 좋은 아침</w:t>
+              <w:br/>
+              <w:t>2-2. 좋은 저녁</w:t>
               <w:br/>
               <w:t>3. 정말 고마워요</w:t>
               <w:br/>
               <w:t>4. 천만에요</w:t>
               <w:br/>
+              <w:t>5-1. 예</w:t>
+              <w:br/>
+              <w:t>5-2. 아니오</w:t>
+              <w:br/>
               <w:t>6. 실례/죄송합니다</w:t>
+              <w:br/>
+              <w:t>7. 괜찮아요</w:t>
               <w:br/>
               <w:t>8. 이름이 무엇인가요?</w:t>
               <w:br/>
               <w:t>9. 제 이름은 ~입니다</w:t>
+              <w:br/>
+              <w:t>10. 몇 살이니?</w:t>
+              <w:br/>
+              <w:t>10-2. 저는 ~살입니다</w:t>
               <w:br/>
               <w:t>11. 화장실 어디 있어요?</w:t>
               <w:br/>
@@ -7713,57 +7743,43 @@
               <w:br/>
               <w:t>14. 참 잘했어요</w:t>
               <w:br/>
+              <w:t>15. 잘 가요</w:t>
+              <w:br/>
               <w:t>16. 다시 만나요</w:t>
+            </w:r>
+          </w:p>
+        </w:tc>
+        <w:tc>
+          <w:tcPr>
+            <w:tcW w:type="dxa" w:w="2160"/>
+            <w:tcMar>
+              <w:top w:w="80" w:type="dxa"/>
+              <w:start w:w="120" w:type="dxa"/>
+              <w:bottom w:w="80" w:type="dxa"/>
+              <w:end w:w="120" w:type="dxa"/>
+            </w:tcMar>
+            <w:vAlign w:val="center"/>
+          </w:tcPr>
+          <w:p>
+            <w:pPr>
+              <w:spacing w:after="0" w:line="276" w:lineRule="auto"/>
+            </w:pPr>
+            <w:r>
+              <w:rPr>
+                <w:rFonts w:ascii="Malgun Gothic" w:hAnsi="Malgun Gothic" w:eastAsia="Malgun Gothic"/>
+                <w:sz w:val="18"/>
+              </w:rPr>
+              <w:t>생활회화 전체 복습 목표 안내</w:t>
               <w:br/>
-              <w:t>17. 예수님이 당신을 사랑해요</w:t>
+              <w:t>인사와 감사 표현 빠른 듣기</w:t>
               <w:br/>
-              <w:t>18. 하나님은 당신을 사랑해요</w:t>
+              <w:t>이름과 나이 질문/대답 짝 연습</w:t>
               <w:br/>
-              <w:t>19. 하나님의 축복을!</w:t>
+              <w:t>식사와 칭찬 표현 따라 말하기</w:t>
               <w:br/>
-              <w:t>20. 하나님은 사랑이십니다</w:t>
+              <w:t>작별 표현으로 마무리 역할극</w:t>
               <w:br/>
-              <w:t>21. 예수님 믿으세요</w:t>
-              <w:br/>
-              <w:t>22. 우리는 당신들을 사랑해요</w:t>
-              <w:br/>
-              <w:t>23. 기도해 드릴게요</w:t>
-              <w:br/>
-              <w:t>24. 함께 찬양해요</w:t>
-            </w:r>
-          </w:p>
-        </w:tc>
-        <w:tc>
-          <w:tcPr>
-            <w:tcW w:type="dxa" w:w="2160"/>
-            <w:tcMar>
-              <w:top w:w="80" w:type="dxa"/>
-              <w:start w:w="120" w:type="dxa"/>
-              <w:bottom w:w="80" w:type="dxa"/>
-              <w:end w:w="120" w:type="dxa"/>
-            </w:tcMar>
-            <w:vAlign w:val="center"/>
-          </w:tcPr>
-          <w:p>
-            <w:pPr>
-              <w:spacing w:after="0" w:line="276" w:lineRule="auto"/>
-            </w:pPr>
-            <w:r>
-              <w:rPr>
-                <w:rFonts w:ascii="Malgun Gothic" w:hAnsi="Malgun Gothic" w:eastAsia="Malgun Gothic"/>
-                <w:sz w:val="18"/>
-              </w:rPr>
-              <w:t>전체 역할극 장면 소개</w:t>
-              <w:br/>
-              <w:t>주제별 핵심 문장 빠른 복습</w:t>
-              <w:br/>
-              <w:t>남성형/여성형 문장 선택 연습</w:t>
-              <w:br/>
-              <w:t>세 역할 역할극</w:t>
-              <w:br/>
-              <w:t>상황 바꾸기와 즉흥 연결</w:t>
-              <w:br/>
-              <w:t>최종 격려와 파송</w:t>
+              <w:t>8월 1일 토요 반복 복습 안내</w:t>
             </w:r>
           </w:p>
         </w:tc>

</xml_diff>